<commit_message>
fix: update blackbox tests and config for improvement plan output changes
Add missing manual_points parameter to ProblemData constructors in
test_blackbox_task003.py (5 tests). Update test_blackbox_task005.py to
match the new Pareto-based recommended_solution.json format — switch
from exact key-set equality to subset checks, rename manual_nodes to
manual_target_nodes, skip obsolete ground_path/routes tests. Add
pytest.ini with marker configuration. Regenerate Word paper output.

Co-Authored-By: Claude Opus 4.6 <noreply@anthropic.com>
</commit_message>
<xml_diff>
--- a/C题论文_多无人机联合巡检优化.docx
+++ b/C题论文_多无人机联合巡检优化.docx
@@ -3230,7 +3230,7 @@
           <w:sz w:val="24"/>
           <w:rFonts w:hint="eastAsia" w:eastAsia="宋体" w:ascii="Times New Roman" w:hAnsi="Times New Roman"/>
         </w:rPr>
-        <w:t xml:space="preserve">本文使用附件“2026C数据.xlsx”中的</w:t>
+        <w:t xml:space="preserve">本文使用附件”2026C数据.xlsx”中的</w:t>
       </w:r>
       <w:r>
         <w:rPr>
@@ -3364,7 +3364,131 @@
           <w:sz w:val="24"/>
           <w:rFonts w:hint="eastAsia" w:eastAsia="宋体" w:ascii="Times New Roman" w:hAnsi="Times New Roman"/>
         </w:rPr>
-        <w:t xml:space="preserve">工作表。读取数据后进行一致性核验，得到表1。</w:t>
+        <w:t xml:space="preserve">工作表。读取数据后进行一致性核验，得到表1。特别说明：人工复核服务时间以</w:t>
+      </w:r>
+      <w:r>
+        <w:rPr>
+          <w:szCs w:val="24"/>
+          <w:sz w:val="24"/>
+          <w:rFonts w:eastAsia="宋体" w:ascii="Times New Roman" w:hAnsi="Times New Roman"/>
+        </w:rPr>
+        <w:t xml:space="preserve"> </w:t>
+      </w:r>
+      <w:r>
+        <w:rPr>
+          <w:szCs w:val="24"/>
+          <w:sz w:val="24"/>
+          <w:rFonts w:eastAsia="宋体" w:ascii="Times New Roman" w:hAnsi="Times New Roman"/>
+          <w:rStyle w:val="VerbatimChar"/>
+        </w:rPr>
+        <w:t xml:space="preserve">ManualPoints</w:t>
+      </w:r>
+      <w:r>
+        <w:rPr>
+          <w:szCs w:val="24"/>
+          <w:sz w:val="24"/>
+          <w:rFonts w:eastAsia="宋体" w:ascii="Times New Roman" w:hAnsi="Times New Roman"/>
+        </w:rPr>
+        <w:t xml:space="preserve"> </w:t>
+      </w:r>
+      <w:r>
+        <w:rPr>
+          <w:szCs w:val="24"/>
+          <w:sz w:val="24"/>
+          <w:rFonts w:hint="eastAsia" w:eastAsia="宋体" w:ascii="Times New Roman" w:hAnsi="Times New Roman"/>
+        </w:rPr>
+        <w:t xml:space="preserve">表为准；</w:t>
+      </w:r>
+      <w:r>
+        <w:rPr>
+          <w:szCs w:val="24"/>
+          <w:sz w:val="24"/>
+          <w:rFonts w:eastAsia="宋体" w:ascii="Times New Roman" w:hAnsi="Times New Roman"/>
+          <w:rStyle w:val="VerbatimChar"/>
+        </w:rPr>
+        <w:t xml:space="preserve">NodeData</w:t>
+      </w:r>
+      <w:r>
+        <w:rPr>
+          <w:szCs w:val="24"/>
+          <w:sz w:val="24"/>
+          <w:rFonts w:eastAsia="宋体" w:ascii="Times New Roman" w:hAnsi="Times New Roman"/>
+        </w:rPr>
+        <w:t xml:space="preserve"> </w:t>
+      </w:r>
+      <w:r>
+        <w:rPr>
+          <w:szCs w:val="24"/>
+          <w:sz w:val="24"/>
+          <w:rFonts w:hint="eastAsia" w:eastAsia="宋体" w:ascii="Times New Roman" w:hAnsi="Times New Roman"/>
+        </w:rPr>
+        <w:t xml:space="preserve">中</w:t>
+      </w:r>
+      <w:r>
+        <w:rPr>
+          <w:szCs w:val="24"/>
+          <w:sz w:val="24"/>
+          <w:rFonts w:eastAsia="宋体" w:ascii="Times New Roman" w:hAnsi="Times New Roman"/>
+        </w:rPr>
+        <w:t xml:space="preserve"> </w:t>
+      </w:r>
+      <w:r>
+        <w:rPr>
+          <w:szCs w:val="24"/>
+          <w:sz w:val="24"/>
+          <w:rFonts w:eastAsia="宋体" w:ascii="Times New Roman" w:hAnsi="Times New Roman"/>
+          <w:rStyle w:val="VerbatimChar"/>
+        </w:rPr>
+        <w:t xml:space="preserve">manual_service_time_s</w:t>
+      </w:r>
+      <w:r>
+        <w:rPr>
+          <w:szCs w:val="24"/>
+          <w:sz w:val="24"/>
+          <w:rFonts w:eastAsia="宋体" w:ascii="Times New Roman" w:hAnsi="Times New Roman"/>
+        </w:rPr>
+        <w:t xml:space="preserve"> </w:t>
+      </w:r>
+      <w:r>
+        <w:rPr>
+          <w:szCs w:val="24"/>
+          <w:sz w:val="24"/>
+          <w:rFonts w:hint="eastAsia" w:eastAsia="宋体" w:ascii="Times New Roman" w:hAnsi="Times New Roman"/>
+        </w:rPr>
+        <w:t xml:space="preserve">仅用于冲突校验，不作为地面时间计算依据。经对比，MP02、MP08、MP09、MP13、MP16共5个人工点在两表中服务时间存在差异，代码取</w:t>
+      </w:r>
+      <w:r>
+        <w:rPr>
+          <w:szCs w:val="24"/>
+          <w:sz w:val="24"/>
+          <w:rFonts w:eastAsia="宋体" w:ascii="Times New Roman" w:hAnsi="Times New Roman"/>
+        </w:rPr>
+        <w:t xml:space="preserve"> </w:t>
+      </w:r>
+      <w:r>
+        <w:rPr>
+          <w:szCs w:val="24"/>
+          <w:sz w:val="24"/>
+          <w:rFonts w:eastAsia="宋体" w:ascii="Times New Roman" w:hAnsi="Times New Roman"/>
+          <w:rStyle w:val="VerbatimChar"/>
+        </w:rPr>
+        <w:t xml:space="preserve">ManualPoints</w:t>
+      </w:r>
+      <w:r>
+        <w:rPr>
+          <w:szCs w:val="24"/>
+          <w:sz w:val="24"/>
+          <w:rFonts w:eastAsia="宋体" w:ascii="Times New Roman" w:hAnsi="Times New Roman"/>
+        </w:rPr>
+        <w:t xml:space="preserve"> </w:t>
+      </w:r>
+      <w:r>
+        <w:rPr>
+          <w:szCs w:val="24"/>
+          <w:sz w:val="24"/>
+          <w:rFonts w:hint="eastAsia" w:eastAsia="宋体" w:ascii="Times New Roman" w:hAnsi="Times New Roman"/>
+        </w:rPr>
+        <w:t xml:space="preserve">值。</w:t>
       </w:r>
     </w:p>
     <w:p>
@@ -15939,7 +16063,7 @@
           <w:sz w:val="24"/>
           <w:rFonts w:hint="eastAsia" w:eastAsia="宋体" w:ascii="Times New Roman" w:hAnsi="Times New Roman"/>
         </w:rPr>
-        <w:t xml:space="preserve">s不同，time-priority方案通过将目标分配到更多并行路线，获得了递减的边际收益。</w:t>
+        <w:t xml:space="preserve">s不同，time-priority方案通过将目标分配到更多并行路线，获得了递减的边际收益。需要说明的是，时间优先子集划分是单趟、不可拆分归属的启发式验证，用于评估多机并行上界潜力；它不等同于含多趟、可拆分悬停的完整原问题精确最优解。</w:t>
       </w:r>
     </w:p>
     <w:bookmarkEnd w:id="44"/>
@@ -18194,39 +18318,39 @@
           <w:sz w:val="24"/>
           <w:rFonts w:hint="eastAsia" w:eastAsia="宋体" w:ascii="Times New Roman" w:hAnsi="Times New Roman"/>
         </w:rPr>
-        <w:t xml:space="preserve">s时，阶段时间已达1588.30</w:t>
-      </w:r>
-      <w:r>
-        <w:rPr>
-          <w:szCs w:val="24"/>
-          <w:sz w:val="24"/>
-          <w:rFonts w:eastAsia="宋体" w:ascii="Times New Roman" w:hAnsi="Times New Roman"/>
-        </w:rPr>
-        <w:t xml:space="preserve"> </w:t>
-      </w:r>
-      <w:r>
-        <w:rPr>
-          <w:szCs w:val="24"/>
-          <w:sz w:val="24"/>
-          <w:rFonts w:hint="eastAsia" w:eastAsia="宋体" w:ascii="Times New Roman" w:hAnsi="Times New Roman"/>
-        </w:rPr>
-        <w:t xml:space="preserve">s，超出运营时长上限2600</w:t>
-      </w:r>
-      <w:r>
-        <w:rPr>
-          <w:szCs w:val="24"/>
-          <w:sz w:val="24"/>
-          <w:rFonts w:eastAsia="宋体" w:ascii="Times New Roman" w:hAnsi="Times New Roman"/>
-        </w:rPr>
-        <w:t xml:space="preserve"> </w:t>
-      </w:r>
-      <w:r>
-        <w:rPr>
-          <w:szCs w:val="24"/>
-          <w:sz w:val="24"/>
-          <w:rFonts w:hint="eastAsia" w:eastAsia="宋体" w:ascii="Times New Roman" w:hAnsi="Times New Roman"/>
-        </w:rPr>
-        <w:t xml:space="preserve">s较多但仍在约束范围内。</w:t>
+        <w:t xml:space="preserve">s时，阶段时间为1588.30</w:t>
+      </w:r>
+      <w:r>
+        <w:rPr>
+          <w:szCs w:val="24"/>
+          <w:sz w:val="24"/>
+          <w:rFonts w:eastAsia="宋体" w:ascii="Times New Roman" w:hAnsi="Times New Roman"/>
+        </w:rPr>
+        <w:t xml:space="preserve"> </w:t>
+      </w:r>
+      <w:r>
+        <w:rPr>
+          <w:szCs w:val="24"/>
+          <w:sz w:val="24"/>
+          <w:rFonts w:hint="eastAsia" w:eastAsia="宋体" w:ascii="Times New Roman" w:hAnsi="Times New Roman"/>
+        </w:rPr>
+        <w:t xml:space="preserve">s，低于运营时长上限2600</w:t>
+      </w:r>
+      <w:r>
+        <w:rPr>
+          <w:szCs w:val="24"/>
+          <w:sz w:val="24"/>
+          <w:rFonts w:eastAsia="宋体" w:ascii="Times New Roman" w:hAnsi="Times New Roman"/>
+        </w:rPr>
+        <w:t xml:space="preserve"> </w:t>
+      </w:r>
+      <w:r>
+        <w:rPr>
+          <w:szCs w:val="24"/>
+          <w:sz w:val="24"/>
+          <w:rFonts w:hint="eastAsia" w:eastAsia="宋体" w:ascii="Times New Roman" w:hAnsi="Times New Roman"/>
+        </w:rPr>
+        <w:t xml:space="preserve">s，仍有余量。</w:t>
       </w:r>
     </w:p>
     <w:p>
@@ -19672,25 +19796,47 @@
           <w:b/>
           <w:bCs/>
         </w:rPr>
-        <w:t xml:space="preserve">“多悬停换取无人机直接确认”</w:t>
-      </w:r>
-      <w:r>
-        <w:rPr>
-          <w:szCs w:val="24"/>
-          <w:sz w:val="24"/>
-          <w:rFonts w:hint="eastAsia" w:eastAsia="宋体" w:ascii="Times New Roman" w:hAnsi="Times New Roman"/>
-          <w:b/>
-          <w:bCs/>
-        </w:rPr>
-        <w:t xml:space="preserve">与“少悬停后转交人工复核”之间的权衡是真实存在的</w:t>
-      </w:r>
-      <w:r>
-        <w:rPr>
-          <w:szCs w:val="24"/>
-          <w:sz w:val="24"/>
-          <w:rFonts w:hint="eastAsia" w:eastAsia="宋体" w:ascii="Times New Roman" w:hAnsi="Times New Roman"/>
-        </w:rPr>
-        <w:t xml:space="preserve">，且“全部直接确认”（能耗不可行）和“全部人工复核”（时间过长）都不是最优方案。联合优化需要在两者之间找到平衡点。</w:t>
+        <w:t xml:space="preserve">”多悬停换取无人机直接确认”与”少悬停后转交人工复核”之间的权衡是真实存在的</w:t>
+      </w:r>
+      <w:r>
+        <w:rPr>
+          <w:szCs w:val="24"/>
+          <w:sz w:val="24"/>
+          <w:rFonts w:hint="eastAsia" w:eastAsia="宋体" w:ascii="Times New Roman" w:hAnsi="Times New Roman"/>
+        </w:rPr>
+        <w:t xml:space="preserve">。全部直接确认方案在当前数据下可行（闭环时间2480</w:t>
+      </w:r>
+      <w:r>
+        <w:rPr>
+          <w:szCs w:val="24"/>
+          <w:sz w:val="24"/>
+          <w:rFonts w:eastAsia="宋体" w:ascii="Times New Roman" w:hAnsi="Times New Roman"/>
+        </w:rPr>
+        <w:t xml:space="preserve"> </w:t>
+      </w:r>
+      <w:r>
+        <w:rPr>
+          <w:szCs w:val="24"/>
+          <w:sz w:val="24"/>
+          <w:rFonts w:hint="eastAsia" w:eastAsia="宋体" w:ascii="Times New Roman" w:hAnsi="Times New Roman"/>
+        </w:rPr>
+        <w:t xml:space="preserve">s，在运营时长约束内，10趟航次），但总能耗和航次数显著增加；全部人工复核方案则闭环时间过长（4533</w:t>
+      </w:r>
+      <w:r>
+        <w:rPr>
+          <w:szCs w:val="24"/>
+          <w:sz w:val="24"/>
+          <w:rFonts w:eastAsia="宋体" w:ascii="Times New Roman" w:hAnsi="Times New Roman"/>
+        </w:rPr>
+        <w:t xml:space="preserve"> </w:t>
+      </w:r>
+      <w:r>
+        <w:rPr>
+          <w:szCs w:val="24"/>
+          <w:sz w:val="24"/>
+          <w:rFonts w:hint="eastAsia" w:eastAsia="宋体" w:ascii="Times New Roman" w:hAnsi="Times New Roman"/>
+        </w:rPr>
+        <w:t xml:space="preserve">s）。因此是否推荐全部直接确认取决于能耗预算与运维成本。联合优化需要在时间、能耗、成本和可靠性之间找到平衡点。</w:t>
       </w:r>
     </w:p>
     <w:p>
@@ -21077,7 +21223,7 @@
       </w:r>
     </w:p>
     <w:bookmarkEnd w:id="59"/>
-    <w:bookmarkStart w:id="63" w:name="推荐闭环方案"/>
+    <w:bookmarkStart w:id="63" w:name="候选池分析与推荐方案"/>
     <w:p>
       <w:pPr>
         <w:spacing w:before="0" w:after="0" w:line="240" w:lineRule="auto"/>
@@ -21102,7 +21248,7 @@
           <w:sz w:val="24"/>
           <w:rFonts w:hint="eastAsia" w:eastAsia="黑体" w:ascii="SimHei" w:hAnsi="SimHei"/>
         </w:rPr>
-        <w:t xml:space="preserve">推荐闭环方案</w:t>
+        <w:t xml:space="preserve">候选池分析与推荐方案</w:t>
       </w:r>
     </w:p>
     <w:p>
@@ -21118,160 +21264,14 @@
           <w:sz w:val="24"/>
           <w:rFonts w:hint="eastAsia" w:eastAsia="宋体" w:ascii="Times New Roman" w:hAnsi="Times New Roman"/>
         </w:rPr>
-        <w:t xml:space="preserve">综合闭环时间、人工复核点数和负载均衡，推荐方案为</w:t>
-      </w:r>
-      <w:r>
-        <w:rPr>
-          <w:szCs w:val="24"/>
-          <w:sz w:val="24"/>
-          <w:rFonts w:eastAsia="宋体" w:ascii="Times New Roman" w:hAnsi="Times New Roman"/>
-        </w:rPr>
-        <w:t xml:space="preserve"> </w:t>
-      </w:r>
-      <m:oMath>
-        <m:r>
-          <m:t>K</m:t>
-        </m:r>
-        <m:r>
-          <m:rPr>
-            <m:sty m:val="p"/>
-          </m:rPr>
-          <m:t>=</m:t>
-        </m:r>
-        <m:r>
-          <m:t>4</m:t>
-        </m:r>
-        <m:r>
-          <m:rPr>
-            <m:sty m:val="p"/>
-          </m:rPr>
-          <m:t>,</m:t>
-        </m:r>
-        <m:r>
-          <m:t>α</m:t>
-        </m:r>
-        <m:r>
-          <m:rPr>
-            <m:sty m:val="p"/>
-          </m:rPr>
-          <m:t>=</m:t>
-        </m:r>
-        <m:r>
-          <m:t>1.00</m:t>
-        </m:r>
-      </m:oMath>
-      <w:r>
-        <w:rPr>
-          <w:szCs w:val="24"/>
-          <w:sz w:val="24"/>
-          <w:rFonts w:hint="eastAsia" w:eastAsia="宋体" w:ascii="Times New Roman" w:hAnsi="Times New Roman"/>
-        </w:rPr>
-        <w:t xml:space="preserve">。该方案的直接确认目标为</w:t>
-      </w:r>
-    </w:p>
-    <w:p>
-      <w:pPr>
-        <w:spacing w:before="0" w:after="0" w:line="240" w:lineRule="auto"/>
-        <w:jc w:val="center"/>
-        <w:pStyle w:val="BodyText"/>
-      </w:pPr>
-      <m:oMathPara>
-        <m:oMathParaPr>
-          <m:jc m:val="center"/>
-        </m:oMathParaPr>
-        <m:oMath>
-          <m:r>
-            <m:t>D</m:t>
-          </m:r>
-          <m:r>
-            <m:rPr>
-              <m:sty m:val="p"/>
-            </m:rPr>
-            <m:t>=</m:t>
-          </m:r>
-          <m:r>
-            <m:rPr>
-              <m:sty m:val="p"/>
-            </m:rPr>
-            <m:t>{</m:t>
-          </m:r>
-          <m:r>
-            <m:t>1</m:t>
-          </m:r>
-          <m:r>
-            <m:rPr>
-              <m:sty m:val="p"/>
-            </m:rPr>
-            <m:t>,</m:t>
-          </m:r>
-          <m:r>
-            <m:t>4</m:t>
-          </m:r>
-          <m:r>
-            <m:rPr>
-              <m:sty m:val="p"/>
-            </m:rPr>
-            <m:t>,</m:t>
-          </m:r>
-          <m:r>
-            <m:t>6</m:t>
-          </m:r>
-          <m:r>
-            <m:rPr>
-              <m:sty m:val="p"/>
-            </m:rPr>
-            <m:t>,</m:t>
-          </m:r>
-          <m:r>
-            <m:t>7</m:t>
-          </m:r>
-          <m:r>
-            <m:rPr>
-              <m:sty m:val="p"/>
-            </m:rPr>
-            <m:t>,</m:t>
-          </m:r>
-          <m:r>
-            <m:t>10</m:t>
-          </m:r>
-          <m:r>
-            <m:rPr>
-              <m:sty m:val="p"/>
-            </m:rPr>
-            <m:t>,</m:t>
-          </m:r>
-          <m:r>
-            <m:t>12</m:t>
-          </m:r>
-          <m:r>
-            <m:rPr>
-              <m:sty m:val="p"/>
-            </m:rPr>
-            <m:t>,</m:t>
-          </m:r>
-          <m:r>
-            <m:t>16</m:t>
-          </m:r>
-          <m:r>
-            <m:rPr>
-              <m:sty m:val="p"/>
-            </m:rPr>
-            <m:t>}</m:t>
-          </m:r>
-          <m:r>
-            <m:rPr>
-              <m:sty m:val="p"/>
-            </m:rPr>
-            <m:t>,</m:t>
-          </m:r>
-        </m:oMath>
-      </m:oMathPara>
+        <w:t xml:space="preserve">问题2的推荐方案通过统一候选池和帕累托筛选确定。候选池包含仅基础巡检、全部直接确认、重建搜索（不同接受容差）、可拆分/不可拆分悬停等8种候选方案。从候选池中筛选可行且满足运营时长约束的候选，再按闭环时间、人工点数、加权人工代价、总能耗、航次数和负载标准差进行帕累托非支配排序。</w:t>
+      </w:r>
     </w:p>
     <w:p>
       <w:pPr>
         <w:spacing w:before="0" w:after="0" w:line="240" w:lineRule="auto"/>
         <w:jc w:val="left"/>
-        <w:pStyle w:val="FirstParagraph"/>
+        <w:pStyle w:val="BodyText"/>
         <w:ind w:firstLine="420"/>
       </w:pPr>
       <w:r>
@@ -21280,265 +21280,62 @@
           <w:sz w:val="24"/>
           <w:rFonts w:hint="eastAsia" w:eastAsia="宋体" w:ascii="Times New Roman" w:hAnsi="Times New Roman"/>
         </w:rPr>
-        <w:t xml:space="preserve">物业人员需复核的人工点为</w:t>
-      </w:r>
-    </w:p>
-    <w:p>
-      <w:pPr>
-        <w:spacing w:before="0" w:after="0" w:line="240" w:lineRule="auto"/>
-        <w:jc w:val="center"/>
-        <w:pStyle w:val="BodyText"/>
-      </w:pPr>
-      <m:oMathPara>
-        <m:oMathParaPr>
-          <m:jc m:val="center"/>
-        </m:oMathParaPr>
-        <m:oMath>
-          <m:r>
-            <m:t>M</m:t>
-          </m:r>
-          <m:r>
-            <m:rPr>
-              <m:sty m:val="p"/>
-            </m:rPr>
-            <m:t>=</m:t>
-          </m:r>
-          <m:r>
-            <m:rPr>
-              <m:sty m:val="p"/>
-            </m:rPr>
-            <m:t>{</m:t>
-          </m:r>
-          <m:r>
-            <m:rPr>
-              <m:sty m:val="p"/>
-            </m:rPr>
-            <m:t>M</m:t>
-          </m:r>
-          <m:r>
-            <m:rPr>
-              <m:sty m:val="p"/>
-            </m:rPr>
-            <m:t>P</m:t>
-          </m:r>
-          <m:r>
-            <m:rPr>
-              <m:sty m:val="p"/>
-            </m:rPr>
-            <m:t>02</m:t>
-          </m:r>
-          <m:r>
-            <m:rPr>
-              <m:sty m:val="p"/>
-            </m:rPr>
-            <m:t>,</m:t>
-          </m:r>
-          <m:r>
-            <m:rPr>
-              <m:sty m:val="p"/>
-            </m:rPr>
-            <m:t>M</m:t>
-          </m:r>
-          <m:r>
-            <m:rPr>
-              <m:sty m:val="p"/>
-            </m:rPr>
-            <m:t>P</m:t>
-          </m:r>
-          <m:r>
-            <m:rPr>
-              <m:sty m:val="p"/>
-            </m:rPr>
-            <m:t>03</m:t>
-          </m:r>
-          <m:r>
-            <m:rPr>
-              <m:sty m:val="p"/>
-            </m:rPr>
-            <m:t>,</m:t>
-          </m:r>
-          <m:r>
-            <m:rPr>
-              <m:sty m:val="p"/>
-            </m:rPr>
-            <m:t>M</m:t>
-          </m:r>
-          <m:r>
-            <m:rPr>
-              <m:sty m:val="p"/>
-            </m:rPr>
-            <m:t>P</m:t>
-          </m:r>
-          <m:r>
-            <m:rPr>
-              <m:sty m:val="p"/>
-            </m:rPr>
-            <m:t>05</m:t>
-          </m:r>
-          <m:r>
-            <m:rPr>
-              <m:sty m:val="p"/>
-            </m:rPr>
-            <m:t>,</m:t>
-          </m:r>
-          <m:r>
-            <m:rPr>
-              <m:sty m:val="p"/>
-            </m:rPr>
-            <m:t>M</m:t>
-          </m:r>
-          <m:r>
-            <m:rPr>
-              <m:sty m:val="p"/>
-            </m:rPr>
-            <m:t>P</m:t>
-          </m:r>
-          <m:r>
-            <m:rPr>
-              <m:sty m:val="p"/>
-            </m:rPr>
-            <m:t>08</m:t>
-          </m:r>
-          <m:r>
-            <m:rPr>
-              <m:sty m:val="p"/>
-            </m:rPr>
-            <m:t>,</m:t>
-          </m:r>
-          <m:r>
-            <m:rPr>
-              <m:sty m:val="p"/>
-            </m:rPr>
-            <m:t>M</m:t>
-          </m:r>
-          <m:r>
-            <m:rPr>
-              <m:sty m:val="p"/>
-            </m:rPr>
-            <m:t>P</m:t>
-          </m:r>
-          <m:r>
-            <m:rPr>
-              <m:sty m:val="p"/>
-            </m:rPr>
-            <m:t>09</m:t>
-          </m:r>
-          <m:r>
-            <m:rPr>
-              <m:sty m:val="p"/>
-            </m:rPr>
-            <m:t>,</m:t>
-          </m:r>
-          <m:r>
-            <m:rPr>
-              <m:sty m:val="p"/>
-            </m:rPr>
-            <m:t>M</m:t>
-          </m:r>
-          <m:r>
-            <m:rPr>
-              <m:sty m:val="p"/>
-            </m:rPr>
-            <m:t>P</m:t>
-          </m:r>
-          <m:r>
-            <m:rPr>
-              <m:sty m:val="p"/>
-            </m:rPr>
-            <m:t>11</m:t>
-          </m:r>
-          <m:r>
-            <m:rPr>
-              <m:sty m:val="p"/>
-            </m:rPr>
-            <m:t>,</m:t>
-          </m:r>
-          <m:r>
-            <m:rPr>
-              <m:sty m:val="p"/>
-            </m:rPr>
-            <m:t>M</m:t>
-          </m:r>
-          <m:r>
-            <m:rPr>
-              <m:sty m:val="p"/>
-            </m:rPr>
-            <m:t>P</m:t>
-          </m:r>
-          <m:r>
-            <m:rPr>
-              <m:sty m:val="p"/>
-            </m:rPr>
-            <m:t>13</m:t>
-          </m:r>
-          <m:r>
-            <m:rPr>
-              <m:sty m:val="p"/>
-            </m:rPr>
-            <m:t>,</m:t>
-          </m:r>
-          <m:r>
-            <m:rPr>
-              <m:sty m:val="p"/>
-            </m:rPr>
-            <m:t>M</m:t>
-          </m:r>
-          <m:r>
-            <m:rPr>
-              <m:sty m:val="p"/>
-            </m:rPr>
-            <m:t>P</m:t>
-          </m:r>
-          <m:r>
-            <m:rPr>
-              <m:sty m:val="p"/>
-            </m:rPr>
-            <m:t>14</m:t>
-          </m:r>
-          <m:r>
-            <m:rPr>
-              <m:sty m:val="p"/>
-            </m:rPr>
-            <m:t>,</m:t>
-          </m:r>
-          <m:r>
-            <m:rPr>
-              <m:sty m:val="p"/>
-            </m:rPr>
-            <m:t>M</m:t>
-          </m:r>
-          <m:r>
-            <m:rPr>
-              <m:sty m:val="p"/>
-            </m:rPr>
-            <m:t>P</m:t>
-          </m:r>
-          <m:r>
-            <m:rPr>
-              <m:sty m:val="p"/>
-            </m:rPr>
-            <m:t>15</m:t>
-          </m:r>
-          <m:r>
-            <m:rPr>
-              <m:sty m:val="p"/>
-            </m:rPr>
-            <m:t>}</m:t>
-          </m:r>
-          <m:r>
-            <m:rPr>
-              <m:sty m:val="p"/>
-            </m:rPr>
-            <m:t>.</m:t>
-          </m:r>
-        </m:oMath>
-      </m:oMathPara>
+        <w:t xml:space="preserve">全部直接确认方案在当前数据下可行：全部16个目标由无人机直接确认，闭环时间2480</w:t>
+      </w:r>
+      <w:r>
+        <w:rPr>
+          <w:szCs w:val="24"/>
+          <w:sz w:val="24"/>
+          <w:rFonts w:eastAsia="宋体" w:ascii="Times New Roman" w:hAnsi="Times New Roman"/>
+        </w:rPr>
+        <w:t xml:space="preserve"> </w:t>
+      </w:r>
+      <w:r>
+        <w:rPr>
+          <w:szCs w:val="24"/>
+          <w:sz w:val="24"/>
+          <w:rFonts w:hint="eastAsia" w:eastAsia="宋体" w:ascii="Times New Roman" w:hAnsi="Times New Roman"/>
+        </w:rPr>
+        <w:t xml:space="preserve">s（在2600</w:t>
+      </w:r>
+      <w:r>
+        <w:rPr>
+          <w:szCs w:val="24"/>
+          <w:sz w:val="24"/>
+          <w:rFonts w:eastAsia="宋体" w:ascii="Times New Roman" w:hAnsi="Times New Roman"/>
+        </w:rPr>
+        <w:t xml:space="preserve"> </w:t>
+      </w:r>
+      <w:r>
+        <w:rPr>
+          <w:szCs w:val="24"/>
+          <w:sz w:val="24"/>
+          <w:rFonts w:hint="eastAsia" w:eastAsia="宋体" w:ascii="Times New Roman" w:hAnsi="Times New Roman"/>
+        </w:rPr>
+        <w:t xml:space="preserve">s运营时长约束内），零人工复核，无人机阶段不涉及地面协同。该方案位于帕累托前沿并在闭环时间和人工点数上均为最优，但总能耗（1235527</w:t>
+      </w:r>
+      <w:r>
+        <w:rPr>
+          <w:szCs w:val="24"/>
+          <w:sz w:val="24"/>
+          <w:rFonts w:eastAsia="宋体" w:ascii="Times New Roman" w:hAnsi="Times New Roman"/>
+        </w:rPr>
+        <w:t xml:space="preserve"> </w:t>
+      </w:r>
+      <w:r>
+        <w:rPr>
+          <w:szCs w:val="24"/>
+          <w:sz w:val="24"/>
+          <w:rFonts w:hint="eastAsia" w:eastAsia="宋体" w:ascii="Times New Roman" w:hAnsi="Times New Roman"/>
+        </w:rPr>
+        <w:t xml:space="preserve">J）和航次数（10趟）显著增加，高负载标准差表明无人机负载不均。</w:t>
+      </w:r>
     </w:p>
     <w:p>
       <w:pPr>
         <w:spacing w:before="0" w:after="0" w:line="240" w:lineRule="auto"/>
         <w:jc w:val="left"/>
-        <w:pStyle w:val="FirstParagraph"/>
+        <w:pStyle w:val="BodyText"/>
         <w:ind w:firstLine="420"/>
       </w:pPr>
       <w:r>
@@ -21547,280 +21344,55 @@
           <w:sz w:val="24"/>
           <w:rFonts w:hint="eastAsia" w:eastAsia="宋体" w:ascii="Times New Roman" w:hAnsi="Times New Roman"/>
         </w:rPr>
-        <w:t xml:space="preserve">物业人员最优路径为</w:t>
-      </w:r>
-    </w:p>
-    <w:p>
-      <w:pPr>
-        <w:spacing w:before="0" w:after="0" w:line="240" w:lineRule="auto"/>
-        <w:jc w:val="center"/>
-        <w:pStyle w:val="BodyText"/>
-      </w:pPr>
-      <m:oMathPara>
-        <m:oMathParaPr>
-          <m:jc m:val="center"/>
-        </m:oMathParaPr>
-        <m:oMath>
-          <m:r>
-            <m:rPr>
-              <m:sty m:val="p"/>
-            </m:rPr>
-            <m:t>P</m:t>
-          </m:r>
-          <m:r>
-            <m:rPr>
-              <m:sty m:val="p"/>
-            </m:rPr>
-            <m:t>0</m:t>
-          </m:r>
-          <m:r>
-            <m:rPr>
-              <m:sty m:val="p"/>
-            </m:rPr>
-            <m:t>→</m:t>
-          </m:r>
-          <m:r>
-            <m:rPr>
-              <m:sty m:val="p"/>
-            </m:rPr>
-            <m:t>M</m:t>
-          </m:r>
-          <m:r>
-            <m:rPr>
-              <m:sty m:val="p"/>
-            </m:rPr>
-            <m:t>P</m:t>
-          </m:r>
-          <m:r>
-            <m:rPr>
-              <m:sty m:val="p"/>
-            </m:rPr>
-            <m:t>13</m:t>
-          </m:r>
-          <m:r>
-            <m:rPr>
-              <m:sty m:val="p"/>
-            </m:rPr>
-            <m:t>→</m:t>
-          </m:r>
-          <m:r>
-            <m:rPr>
-              <m:sty m:val="p"/>
-            </m:rPr>
-            <m:t>M</m:t>
-          </m:r>
-          <m:r>
-            <m:rPr>
-              <m:sty m:val="p"/>
-            </m:rPr>
-            <m:t>P</m:t>
-          </m:r>
-          <m:r>
-            <m:rPr>
-              <m:sty m:val="p"/>
-            </m:rPr>
-            <m:t>14</m:t>
-          </m:r>
-          <m:r>
-            <m:rPr>
-              <m:sty m:val="p"/>
-            </m:rPr>
-            <m:t>→</m:t>
-          </m:r>
-          <m:r>
-            <m:rPr>
-              <m:sty m:val="p"/>
-            </m:rPr>
-            <m:t>M</m:t>
-          </m:r>
-          <m:r>
-            <m:rPr>
-              <m:sty m:val="p"/>
-            </m:rPr>
-            <m:t>P</m:t>
-          </m:r>
-          <m:r>
-            <m:rPr>
-              <m:sty m:val="p"/>
-            </m:rPr>
-            <m:t>15</m:t>
-          </m:r>
-          <m:r>
-            <m:rPr>
-              <m:sty m:val="p"/>
-            </m:rPr>
-            <m:t>→</m:t>
-          </m:r>
-          <m:r>
-            <m:rPr>
-              <m:sty m:val="p"/>
-            </m:rPr>
-            <m:t>M</m:t>
-          </m:r>
-          <m:r>
-            <m:rPr>
-              <m:sty m:val="p"/>
-            </m:rPr>
-            <m:t>P</m:t>
-          </m:r>
-          <m:r>
-            <m:rPr>
-              <m:sty m:val="p"/>
-            </m:rPr>
-            <m:t>02</m:t>
-          </m:r>
-          <m:r>
-            <m:rPr>
-              <m:sty m:val="p"/>
-            </m:rPr>
-            <m:t>→</m:t>
-          </m:r>
-          <m:r>
-            <m:rPr>
-              <m:sty m:val="p"/>
-            </m:rPr>
-            <m:t>M</m:t>
-          </m:r>
-          <m:r>
-            <m:rPr>
-              <m:sty m:val="p"/>
-            </m:rPr>
-            <m:t>P</m:t>
-          </m:r>
-          <m:r>
-            <m:rPr>
-              <m:sty m:val="p"/>
-            </m:rPr>
-            <m:t>03</m:t>
-          </m:r>
-          <m:r>
-            <m:rPr>
-              <m:sty m:val="p"/>
-            </m:rPr>
-            <m:t>→</m:t>
-          </m:r>
-          <m:r>
-            <m:rPr>
-              <m:sty m:val="p"/>
-            </m:rPr>
-            <m:t>M</m:t>
-          </m:r>
-          <m:r>
-            <m:rPr>
-              <m:sty m:val="p"/>
-            </m:rPr>
-            <m:t>P</m:t>
-          </m:r>
-          <m:r>
-            <m:rPr>
-              <m:sty m:val="p"/>
-            </m:rPr>
-            <m:t>05</m:t>
-          </m:r>
-          <m:r>
-            <m:rPr>
-              <m:sty m:val="p"/>
-            </m:rPr>
-            <m:t>→</m:t>
-          </m:r>
-          <m:r>
-            <m:rPr>
-              <m:sty m:val="p"/>
-            </m:rPr>
-            <m:t>M</m:t>
-          </m:r>
-          <m:r>
-            <m:rPr>
-              <m:sty m:val="p"/>
-            </m:rPr>
-            <m:t>P</m:t>
-          </m:r>
-          <m:r>
-            <m:rPr>
-              <m:sty m:val="p"/>
-            </m:rPr>
-            <m:t>08</m:t>
-          </m:r>
-          <m:r>
-            <m:rPr>
-              <m:sty m:val="p"/>
-            </m:rPr>
-            <m:t>→</m:t>
-          </m:r>
-          <m:r>
-            <m:rPr>
-              <m:sty m:val="p"/>
-            </m:rPr>
-            <m:t>M</m:t>
-          </m:r>
-          <m:r>
-            <m:rPr>
-              <m:sty m:val="p"/>
-            </m:rPr>
-            <m:t>P</m:t>
-          </m:r>
-          <m:r>
-            <m:rPr>
-              <m:sty m:val="p"/>
-            </m:rPr>
-            <m:t>09</m:t>
-          </m:r>
-          <m:r>
-            <m:rPr>
-              <m:sty m:val="p"/>
-            </m:rPr>
-            <m:t>→</m:t>
-          </m:r>
-          <m:r>
-            <m:rPr>
-              <m:sty m:val="p"/>
-            </m:rPr>
-            <m:t>M</m:t>
-          </m:r>
-          <m:r>
-            <m:rPr>
-              <m:sty m:val="p"/>
-            </m:rPr>
-            <m:t>P</m:t>
-          </m:r>
-          <m:r>
-            <m:rPr>
-              <m:sty m:val="p"/>
-            </m:rPr>
-            <m:t>11</m:t>
-          </m:r>
-          <m:r>
-            <m:rPr>
-              <m:sty m:val="p"/>
-            </m:rPr>
-            <m:t>→</m:t>
-          </m:r>
-          <m:r>
-            <m:rPr>
-              <m:sty m:val="p"/>
-            </m:rPr>
-            <m:t>P</m:t>
-          </m:r>
-          <m:r>
-            <m:rPr>
-              <m:sty m:val="p"/>
-            </m:rPr>
-            <m:t>0</m:t>
-          </m:r>
-          <m:r>
-            <m:rPr>
-              <m:sty m:val="p"/>
-            </m:rPr>
-            <m:t>.</m:t>
-          </m:r>
-        </m:oMath>
-      </m:oMathPara>
+        <w:t xml:space="preserve">推荐规则：（1）若存在闭环时间≤2600</w:t>
+      </w:r>
+      <w:r>
+        <w:rPr>
+          <w:szCs w:val="24"/>
+          <w:sz w:val="24"/>
+          <w:rFonts w:eastAsia="宋体" w:ascii="Times New Roman" w:hAnsi="Times New Roman"/>
+        </w:rPr>
+        <w:t xml:space="preserve"> </w:t>
+      </w:r>
+      <w:r>
+        <w:rPr>
+          <w:szCs w:val="24"/>
+          <w:sz w:val="24"/>
+          <w:rFonts w:hint="eastAsia" w:eastAsia="宋体" w:ascii="Times New Roman" w:hAnsi="Times New Roman"/>
+        </w:rPr>
+        <w:t xml:space="preserve">s且人工点数≤2的帕累托前沿候选，优先按加权人工代价、总能耗和航次数排序选择；（2）否则按固定权重（闭环时间0.40、加权人工代价0.20、人工点数0.15、总能耗0.10、航次数0.10、负载标准差0.05）评分选择。最终推荐方案写入</w:t>
+      </w:r>
+      <w:r>
+        <w:rPr>
+          <w:szCs w:val="24"/>
+          <w:sz w:val="24"/>
+          <w:rFonts w:eastAsia="宋体" w:ascii="Times New Roman" w:hAnsi="Times New Roman"/>
+        </w:rPr>
+        <w:t xml:space="preserve"> </w:t>
+      </w:r>
+      <w:r>
+        <w:rPr>
+          <w:szCs w:val="24"/>
+          <w:sz w:val="24"/>
+          <w:rFonts w:eastAsia="宋体" w:ascii="Times New Roman" w:hAnsi="Times New Roman"/>
+          <w:rStyle w:val="VerbatimChar"/>
+        </w:rPr>
+        <w:t xml:space="preserve">recommended_solution.json</w:t>
+      </w:r>
+      <w:r>
+        <w:rPr>
+          <w:szCs w:val="24"/>
+          <w:sz w:val="24"/>
+          <w:rFonts w:hint="eastAsia" w:eastAsia="宋体" w:ascii="Times New Roman" w:hAnsi="Times New Roman"/>
+        </w:rPr>
+        <w:t xml:space="preserve">，选择规则和推荐理由均记录在文件中。</w:t>
+      </w:r>
     </w:p>
     <w:p>
       <w:pPr>
         <w:spacing w:before="0" w:after="0" w:line="240" w:lineRule="auto"/>
         <w:jc w:val="left"/>
-        <w:pStyle w:val="FirstParagraph"/>
+        <w:pStyle w:val="BodyText"/>
         <w:ind w:firstLine="420"/>
       </w:pPr>
       <w:r>
@@ -21829,47 +21401,7 @@
           <w:sz w:val="24"/>
           <w:rFonts w:hint="eastAsia" w:eastAsia="宋体" w:ascii="Times New Roman" w:hAnsi="Times New Roman"/>
         </w:rPr>
-        <w:t xml:space="preserve">该路径的通行时间为1061</w:t>
-      </w:r>
-      <w:r>
-        <w:rPr>
-          <w:szCs w:val="24"/>
-          <w:sz w:val="24"/>
-          <w:rFonts w:eastAsia="宋体" w:ascii="Times New Roman" w:hAnsi="Times New Roman"/>
-        </w:rPr>
-        <w:t xml:space="preserve"> </w:t>
-      </w:r>
-      <w:r>
-        <w:rPr>
-          <w:szCs w:val="24"/>
-          <w:sz w:val="24"/>
-          <w:rFonts w:hint="eastAsia" w:eastAsia="宋体" w:ascii="Times New Roman" w:hAnsi="Times New Roman"/>
-        </w:rPr>
-        <w:t xml:space="preserve">s，现场服务时间为1608</w:t>
-      </w:r>
-      <w:r>
-        <w:rPr>
-          <w:szCs w:val="24"/>
-          <w:sz w:val="24"/>
-          <w:rFonts w:eastAsia="宋体" w:ascii="Times New Roman" w:hAnsi="Times New Roman"/>
-        </w:rPr>
-        <w:t xml:space="preserve"> </w:t>
-      </w:r>
-      <w:r>
-        <w:rPr>
-          <w:szCs w:val="24"/>
-          <w:sz w:val="24"/>
-          <w:rFonts w:hint="eastAsia" w:eastAsia="宋体" w:ascii="Times New Roman" w:hAnsi="Times New Roman"/>
-        </w:rPr>
-        <w:t xml:space="preserve">s，地面复核总时间为2669</w:t>
-      </w:r>
-      <w:r>
-        <w:rPr>
-          <w:szCs w:val="24"/>
-          <w:sz w:val="24"/>
-          <w:rFonts w:eastAsia="宋体" w:ascii="Times New Roman" w:hAnsi="Times New Roman"/>
-        </w:rPr>
-        <w:t xml:space="preserve"> s。</w:t>
+        <w:t xml:space="preserve">推荐方案不来自单一启发式的链末端，而是经过候选池→可行性过滤→帕累托筛选→业务规则选择的完整流程。</w:t>
       </w:r>
     </w:p>
     <w:p>

</xml_diff>